<commit_message>
Update CV with portfolio link
Co-Authored-By: Claude Sonnet 5.5 <noreply@anthropic.com>
Claude-Session: https://claude.ai/code/session_01QtVH1iEaUKPXQjPJhZRqBp
</commit_message>
<xml_diff>
--- a/Jansher_Khan_CV.docx
+++ b/Jansher_Khan_CV.docx
@@ -75,6 +75,25 @@
             <w:u w:val="single"/>
           </w:rPr>
           <w:t>GitHub</w:t>
+        </w:r>
+      </w:hyperlink>
+      <w:r>
+        <w:rPr>
+          <w:color w:val="555555"/>
+          <w:sz w:val="18"/>
+          <w:szCs w:val="18"/>
+        </w:rPr>
+        <w:t xml:space="preserve">   |   </w:t>
+      </w:r>
+      <w:hyperlink r:id="rId20" w:history="1">
+        <w:r>
+          <w:rPr>
+            <w:color w:val="1F3864"/>
+            <w:sz w:val="18"/>
+            <w:szCs w:val="18"/>
+            <w:u w:val="single"/>
+          </w:rPr>
+          <w:t>Portfolio</w:t>
         </w:r>
       </w:hyperlink>
     </w:p>

</xml_diff>